<commit_message>
added mobilfunk tag to all contracts for mobile, also removed document validator section from sidebar
</commit_message>
<xml_diff>
--- a/backend/data/Kündigung nach TKG 1&1.docx
+++ b/backend/data/Kündigung nach TKG 1&1.docx
@@ -1157,19 +1157,7 @@
         <w:rPr>
           <w:rFonts w:ascii="Calibri" w:hAnsi="Calibri" w:cs="Calibri"/>
         </w:rPr>
-        <w:t>6</w:t>
-      </w:r>
-      <w:r>
-        <w:rPr>
-          <w:rFonts w:ascii="Calibri" w:hAnsi="Calibri" w:cs="Calibri"/>
-        </w:rPr>
-        <w:t>.</w:t>
-      </w:r>
-      <w:r>
-        <w:rPr>
-          <w:rFonts w:ascii="Calibri" w:hAnsi="Calibri" w:cs="Calibri"/>
-        </w:rPr>
-        <w:t>3</w:t>
+        <w:t>7</w:t>
       </w:r>
       <w:r>
         <w:rPr>
@@ -1237,7 +1225,37 @@
         <w:rPr>
           <w:rFonts w:ascii="Calibri" w:hAnsi="Calibri" w:cs="Calibri"/>
         </w:rPr>
-        <w:t>","1und1"],</w:t>
+        <w:t>","1und1</w:t>
+      </w:r>
+      <w:r>
+        <w:rPr>
+          <w:rFonts w:ascii="Calibri" w:hAnsi="Calibri" w:cs="Calibri"/>
+        </w:rPr>
+        <w:t>"</w:t>
+      </w:r>
+      <w:r>
+        <w:rPr>
+          <w:rFonts w:ascii="Calibri" w:hAnsi="Calibri" w:cs="Calibri"/>
+        </w:rPr>
+        <w:t>,"</w:t>
+      </w:r>
+      <w:r>
+        <w:rPr>
+          <w:rFonts w:ascii="Calibri" w:hAnsi="Calibri" w:cs="Calibri"/>
+        </w:rPr>
+        <w:t>Mobilfunk</w:t>
+      </w:r>
+      <w:r>
+        <w:rPr>
+          <w:rFonts w:ascii="Calibri" w:hAnsi="Calibri" w:cs="Calibri"/>
+        </w:rPr>
+        <w:t>"</w:t>
+      </w:r>
+      <w:r>
+        <w:rPr>
+          <w:rFonts w:ascii="Calibri" w:hAnsi="Calibri" w:cs="Calibri"/>
+        </w:rPr>
+        <w:t>],</w:t>
       </w:r>
     </w:p>
     <w:p>
@@ -1257,6 +1275,30 @@
           <w:rFonts w:ascii="Calibri" w:hAnsi="Calibri" w:cs="Calibri"/>
         </w:rPr>
         <w:t>"provider":["1&amp;1"]</w:t>
+      </w:r>
+      <w:r>
+        <w:rPr>
+          <w:rFonts w:ascii="Calibri" w:hAnsi="Calibri" w:cs="Calibri"/>
+        </w:rPr>
+        <w:t>,</w:t>
+      </w:r>
+      <w:r>
+        <w:rPr>
+          <w:rFonts w:ascii="Calibri" w:hAnsi="Calibri" w:cs="Calibri"/>
+        </w:rPr>
+        <w:br/>
+      </w:r>
+      <w:r>
+        <w:rPr>
+          <w:rFonts w:ascii="Calibri" w:hAnsi="Calibri" w:cs="Calibri"/>
+        </w:rPr>
+        <w:tab/>
+      </w:r>
+      <w:r>
+        <w:rPr>
+          <w:rFonts w:ascii="Calibri" w:hAnsi="Calibri" w:cs="Calibri"/>
+        </w:rPr>
+        <w:t>"vertragstyp":["Mobilfunk"]</w:t>
       </w:r>
     </w:p>
     <w:p>
@@ -1353,6 +1395,7 @@
         <w:rPr>
           <w:rFonts w:ascii="Calibri" w:hAnsi="Calibri" w:cs="Calibri"/>
         </w:rPr>
+        <w:lastRenderedPageBreak/>
         <w:t xml:space="preserve">            ]</w:t>
       </w:r>
     </w:p>
@@ -1366,7 +1409,6 @@
         <w:rPr>
           <w:rFonts w:ascii="Calibri" w:hAnsi="Calibri" w:cs="Calibri"/>
         </w:rPr>
-        <w:lastRenderedPageBreak/>
         <w:t xml:space="preserve">        },</w:t>
       </w:r>
     </w:p>

</xml_diff>